<commit_message>
Added everyones credits to the tops of the pages to the best of my knowldegs
Co-authored-by: Copilot <copilot@github.com>
</commit_message>
<xml_diff>
--- a/Implementation.docx
+++ b/Implementation.docx
@@ -35,7 +35,13 @@
       </w:r>
       <w:proofErr w:type="spellEnd"/>
       <w:r>
-        <w:t>-connector is a library that had drivers for Python that we all used last year for setting up database connectivity. However, when it came to the framework for displaying the GUI and providing functionality with the front end, it was a more difficult decision.</w:t>
+        <w:t>-connector is a library that ha</w:t>
+      </w:r>
+      <w:r>
+        <w:t>s</w:t>
+      </w:r>
+      <w:r>
+        <w:t xml:space="preserve"> drivers for Python that we all used last year for setting up database connectivity. However, when it came to the framework for displaying the GUI and providing functionality with the front end, it was a more difficult decision.</w:t>
       </w:r>
     </w:p>
     <w:p>
@@ -65,7 +71,13 @@
     <w:p>
       <w:proofErr w:type="spellStart"/>
       <w:r>
-        <w:t>Pyside</w:t>
+        <w:t>Py</w:t>
+      </w:r>
+      <w:r>
+        <w:t>S</w:t>
+      </w:r>
+      <w:r>
+        <w:t>ide</w:t>
       </w:r>
       <w:proofErr w:type="spellEnd"/>
       <w:r>
@@ -73,11 +85,17 @@
       </w:r>
       <w:proofErr w:type="spellStart"/>
       <w:r>
-        <w:t>Pyside</w:t>
-      </w:r>
-      <w:proofErr w:type="spellEnd"/>
-      <w:r>
-        <w:t xml:space="preserve"> 6 is a contains a vast number of cross-platform compatible widgets. These widgets range from labels and buttons to whole windows and pop ups.</w:t>
+        <w:t>Py</w:t>
+      </w:r>
+      <w:r>
+        <w:t>S</w:t>
+      </w:r>
+      <w:r>
+        <w:t>ide</w:t>
+      </w:r>
+      <w:proofErr w:type="spellEnd"/>
+      <w:r>
+        <w:t xml:space="preserve"> 6 contains a vast number of cross-platform compatible widgets. These widgets range from labels and buttons to whole windows and pop ups.</w:t>
       </w:r>
       <w:r>
         <w:br/>
@@ -88,11 +106,23 @@
       </w:r>
       <w:proofErr w:type="spellStart"/>
       <w:r>
-        <w:t>Pyside</w:t>
-      </w:r>
-      <w:proofErr w:type="spellEnd"/>
-      <w:r>
-        <w:t xml:space="preserve"> was that it comes with Qt Designer, an application that makes the designing stage of development must more efficient. Qt Designer allows a user to drag and drop buttons and labels to where they would like them. This gives a graphical preview of the window currently being created and prevents the waste of time with setting up basic values such as position and parents. However, the functionality of these widgets must be connected to functions written in the front end and only provides support with the designing stage.</w:t>
+        <w:t>Py</w:t>
+      </w:r>
+      <w:r>
+        <w:t>S</w:t>
+      </w:r>
+      <w:r>
+        <w:t>ide</w:t>
+      </w:r>
+      <w:proofErr w:type="spellEnd"/>
+      <w:r>
+        <w:t xml:space="preserve"> was that it </w:t>
+      </w:r>
+      <w:r>
+        <w:t xml:space="preserve">came </w:t>
+      </w:r>
+      <w:r>
+        <w:t>with Qt Designer, an application that makes the designing stage of development must more efficient. Qt Designer allows a user to drag and drop buttons and labels to where they would like them. This gives a graphical preview of the window currently being created and prevents the waste of time with setting up basic values such as position and parents. However, the functionality of these widgets must be connected to functions written in the front end and only provides support with the designing stage.</w:t>
       </w:r>
       <w:r>
         <w:br/>
@@ -147,7 +177,7 @@
       </w:r>
       <w:proofErr w:type="spellEnd"/>
       <w:r>
-        <w:t xml:space="preserve"> hides all other pages and only shows then widgets related to that page index. This creates an incredible method of traversal through that application that is both seamless and professional.</w:t>
+        <w:t xml:space="preserve"> hides all other pages and only shows the widgets related to that page index. This creates an incredible method of traversal through that application that is both seamless and professional.</w:t>
       </w:r>
       <w:r>
         <w:br/>
@@ -200,7 +230,13 @@
       </w:r>
       <w:proofErr w:type="spellEnd"/>
       <w:r>
-        <w:t xml:space="preserve"> comes preinstalled when downloading the distribution. It provides an interface for Tk and </w:t>
+        <w:t xml:space="preserve"> comes preinstalled when downloading </w:t>
+      </w:r>
+      <w:r>
+        <w:t>Python</w:t>
+      </w:r>
+      <w:r>
+        <w:t xml:space="preserve">. It provides an interface for Tk and </w:t>
       </w:r>
       <w:proofErr w:type="spellStart"/>
       <w:r>
@@ -212,12 +248,15 @@
       </w:r>
       <w:proofErr w:type="spellStart"/>
       <w:r>
+        <w:t>Tcl</w:t>
+      </w:r>
+      <w:proofErr w:type="spellEnd"/>
+      <w:r>
+        <w:t xml:space="preserve">, contains </w:t>
+      </w:r>
+      <w:r>
         <w:lastRenderedPageBreak/>
-        <w:t>Tcl</w:t>
-      </w:r>
-      <w:proofErr w:type="spellEnd"/>
-      <w:r>
-        <w:t>, contains the necessary scripts for building and running the window and Toolkit, Tk, contains the widgets and GUI components to display the application and business logic.</w:t>
+        <w:t>the necessary scripts for building and running the window and Toolkit, Tk, contains the widgets and GUI components to display the application and business logic.</w:t>
       </w:r>
       <w:r>
         <w:br/>
@@ -243,6 +282,79 @@
         <w:t xml:space="preserve"> has a much larger list of widgets that are highly specialised in their function.</w:t>
       </w:r>
     </w:p>
+    <w:p>
+      <w:r>
+        <w:t>Conclusion</w:t>
+      </w:r>
+    </w:p>
+    <w:p>
+      <w:r>
+        <w:t xml:space="preserve">We decided to use </w:t>
+      </w:r>
+      <w:proofErr w:type="spellStart"/>
+      <w:r>
+        <w:t>PySide</w:t>
+      </w:r>
+      <w:proofErr w:type="spellEnd"/>
+      <w:r>
+        <w:t xml:space="preserve"> due to a combination of the developer tools available and the professional view of the widgets. </w:t>
+      </w:r>
+      <w:proofErr w:type="spellStart"/>
+      <w:r>
+        <w:t>Tkinter</w:t>
+      </w:r>
+      <w:proofErr w:type="spellEnd"/>
+      <w:r>
+        <w:t xml:space="preserve"> may offer a</w:t>
+      </w:r>
+      <w:r>
+        <w:t>n</w:t>
+      </w:r>
+      <w:r>
+        <w:t xml:space="preserve"> easy syntax to learn but </w:t>
+      </w:r>
+      <w:proofErr w:type="spellStart"/>
+      <w:r>
+        <w:t>PySide</w:t>
+      </w:r>
+      <w:proofErr w:type="spellEnd"/>
+      <w:r>
+        <w:t xml:space="preserve"> offers a far wider </w:t>
+      </w:r>
+      <w:r>
+        <w:t>selection of functionality preinstalled. Also</w:t>
+      </w:r>
+      <w:r>
+        <w:t>,</w:t>
+      </w:r>
+      <w:r>
+        <w:t xml:space="preserve"> QT Designer allows to bridge the gap between the </w:t>
+      </w:r>
+      <w:proofErr w:type="spellStart"/>
+      <w:r>
+        <w:t>Tkinter</w:t>
+      </w:r>
+      <w:proofErr w:type="spellEnd"/>
+      <w:r>
+        <w:t xml:space="preserve"> and </w:t>
+      </w:r>
+      <w:proofErr w:type="spellStart"/>
+      <w:r>
+        <w:t>PySide</w:t>
+      </w:r>
+      <w:proofErr w:type="spellEnd"/>
+      <w:r>
+        <w:t xml:space="preserve"> in ease of use, allowing us to focus heavily on the implementation and beginning development</w:t>
+      </w:r>
+      <w:r>
+        <w:t xml:space="preserve"> immediately</w:t>
+      </w:r>
+      <w:r>
+        <w:t>.</w:t>
+      </w:r>
+    </w:p>
+    <w:p/>
+    <w:p/>
     <w:p/>
     <w:sectPr>
       <w:pgSz w:w="11906" w:h="16838"/>

</xml_diff>